<commit_message>
Add `OpexProcessor` with expired short calls handling logic
- Implemented `OpexProcessor` to manage expired short calls using `CagrTable` and `SnapshotTable`.
- Extended `SymbolTranslator.to_cagr_values` to handle tranche logic accurately.
- Added initial unit tests for `OpexProcessor` setup and functionality.
</commit_message>
<xml_diff>
--- a/resources/docs/Short Calls.docx
+++ b/resources/docs/Short Calls.docx
@@ -385,7 +385,23 @@
         <w:t xml:space="preserve">” = </w:t>
       </w:r>
       <w:r>
-        <w:t>OPEX closing time [** EbffTrading has an OpexCalendar to do this]</w:t>
+        <w:t xml:space="preserve">OPEX closing time [** </w:t>
+      </w:r>
+      <w:proofErr w:type="spellStart"/>
+      <w:r>
+        <w:t>EbffTrading</w:t>
+      </w:r>
+      <w:proofErr w:type="spellEnd"/>
+      <w:r>
+        <w:t xml:space="preserve"> has an </w:t>
+      </w:r>
+      <w:proofErr w:type="spellStart"/>
+      <w:r>
+        <w:t>OpexCalendar</w:t>
+      </w:r>
+      <w:proofErr w:type="spellEnd"/>
+      <w:r>
+        <w:t xml:space="preserve"> to do this]</w:t>
       </w:r>
     </w:p>
     <w:p>
@@ -466,7 +482,132 @@
         </w:numPr>
       </w:pPr>
       <w:r>
-        <w:t>IF Assignment, we need to find matching long position and close it at assignment price</w:t>
+        <w:t>IF Assignment, we need to find matching long</w:t>
+      </w:r>
+      <w:r>
+        <w:t>-</w:t>
+      </w:r>
+      <w:r>
+        <w:t>position and close it at assignment price</w:t>
+      </w:r>
+    </w:p>
+    <w:p>
+      <w:pPr>
+        <w:pStyle w:val="ListParagraph"/>
+        <w:numPr>
+          <w:ilvl w:val="2"/>
+          <w:numId w:val="2"/>
+        </w:numPr>
+      </w:pPr>
+      <w:r>
+        <w:t>SNAP</w:t>
+      </w:r>
+    </w:p>
+    <w:p>
+      <w:pPr>
+        <w:pStyle w:val="ListParagraph"/>
+        <w:numPr>
+          <w:ilvl w:val="3"/>
+          <w:numId w:val="2"/>
+        </w:numPr>
+      </w:pPr>
+      <w:r>
+        <w:t>Clear Columns</w:t>
+      </w:r>
+      <w:r>
+        <w:tab/>
+        <w:t xml:space="preserve"> </w:t>
+      </w:r>
+      <w:r>
+        <w:tab/>
+        <w:t xml:space="preserve"> </w:t>
+      </w:r>
+      <w:r>
+        <w:tab/>
+        <w:t xml:space="preserve"> </w:t>
+      </w:r>
+      <w:r>
+        <w:tab/>
+        <w:t xml:space="preserve"> </w:t>
+      </w:r>
+      <w:r>
+        <w:tab/>
+        <w:t xml:space="preserve"> </w:t>
+      </w:r>
+    </w:p>
+    <w:p>
+      <w:pPr>
+        <w:pStyle w:val="ListParagraph"/>
+        <w:numPr>
+          <w:ilvl w:val="4"/>
+          <w:numId w:val="2"/>
+        </w:numPr>
+      </w:pPr>
+      <w:r>
+        <w:t>SC Exp Date</w:t>
+      </w:r>
+      <w:r>
+        <w:t xml:space="preserve">, </w:t>
+      </w:r>
+      <w:r>
+        <w:t>SC Strike Price</w:t>
+      </w:r>
+      <w:r>
+        <w:t>,</w:t>
+      </w:r>
+      <w:r>
+        <w:t xml:space="preserve"> </w:t>
+      </w:r>
+      <w:r>
+        <w:t>SC Qty</w:t>
+      </w:r>
+      <w:r>
+        <w:t>,</w:t>
+      </w:r>
+      <w:r>
+        <w:t xml:space="preserve"> </w:t>
+      </w:r>
+      <w:r>
+        <w:t>SC Book Date</w:t>
+      </w:r>
+      <w:r>
+        <w:t xml:space="preserve">, </w:t>
+      </w:r>
+      <w:r>
+        <w:t>SC Fill Date</w:t>
+      </w:r>
+      <w:r>
+        <w:t>,</w:t>
+      </w:r>
+      <w:r>
+        <w:t xml:space="preserve"> </w:t>
+      </w:r>
+      <w:r>
+        <w:t>SC Book Price</w:t>
+      </w:r>
+      <w:r>
+        <w:t xml:space="preserve">, </w:t>
+      </w:r>
+      <w:r>
+        <w:t>SC Fill Delta</w:t>
+      </w:r>
+      <w:r>
+        <w:t xml:space="preserve">, </w:t>
+      </w:r>
+      <w:r>
+        <w:t xml:space="preserve">SC Current Ask </w:t>
+      </w:r>
+      <w:r>
+        <w:t xml:space="preserve">, </w:t>
+      </w:r>
+      <w:r>
+        <w:t>SC Current Delta</w:t>
+      </w:r>
+      <w:r>
+        <w:t xml:space="preserve">, </w:t>
+      </w:r>
+      <w:r>
+        <w:t>SC Buy Back Cutoff</w:t>
       </w:r>
     </w:p>
     <w:p>

</xml_diff>

<commit_message>
Refactor expired short calls logic in `SnapshotTable` to use `TransactionEventType` enums and enhance premium parsing in `OpexProcessor`
</commit_message>
<xml_diff>
--- a/resources/docs/Short Calls.docx
+++ b/resources/docs/Short Calls.docx
@@ -389,7 +389,7 @@
       </w:r>
       <w:proofErr w:type="spellStart"/>
       <w:r>
-        <w:t>EbffTrading</w:t>
+        <w:t>EbfTrading</w:t>
       </w:r>
       <w:proofErr w:type="spellEnd"/>
       <w:r>
@@ -608,6 +608,93 @@
       </w:r>
       <w:r>
         <w:t>SC Buy Back Cutoff</w:t>
+      </w:r>
+    </w:p>
+    <w:p>
+      <w:r>
+        <w:rPr>
+          <w:noProof/>
+          <w14:ligatures w14:val="standardContextual"/>
+        </w:rPr>
+        <w:drawing>
+          <wp:inline distT="0" distB="0" distL="0" distR="0" wp14:anchorId="58B27DC7" wp14:editId="2C543EDC">
+            <wp:extent cx="6858000" cy="1871980"/>
+            <wp:effectExtent l="0" t="0" r="0" b="0"/>
+            <wp:docPr id="1323550172" name="Picture 1"/>
+            <wp:cNvGraphicFramePr>
+              <a:graphicFrameLocks xmlns:a="http://schemas.openxmlformats.org/drawingml/2006/main" noChangeAspect="1"/>
+            </wp:cNvGraphicFramePr>
+            <a:graphic xmlns:a="http://schemas.openxmlformats.org/drawingml/2006/main">
+              <a:graphicData uri="http://schemas.openxmlformats.org/drawingml/2006/picture">
+                <pic:pic xmlns:pic="http://schemas.openxmlformats.org/drawingml/2006/picture">
+                  <pic:nvPicPr>
+                    <pic:cNvPr id="1323550172" name=""/>
+                    <pic:cNvPicPr/>
+                  </pic:nvPicPr>
+                  <pic:blipFill>
+                    <a:blip r:embed="rId5"/>
+                    <a:stretch>
+                      <a:fillRect/>
+                    </a:stretch>
+                  </pic:blipFill>
+                  <pic:spPr>
+                    <a:xfrm>
+                      <a:off x="0" y="0"/>
+                      <a:ext cx="6858000" cy="1871980"/>
+                    </a:xfrm>
+                    <a:prstGeom prst="rect">
+                      <a:avLst/>
+                    </a:prstGeom>
+                  </pic:spPr>
+                </pic:pic>
+              </a:graphicData>
+            </a:graphic>
+          </wp:inline>
+        </w:drawing>
+      </w:r>
+    </w:p>
+    <w:p>
+      <w:r>
+        <w:rPr>
+          <w:noProof/>
+          <w14:ligatures w14:val="standardContextual"/>
+        </w:rPr>
+        <w:lastRenderedPageBreak/>
+        <w:drawing>
+          <wp:inline distT="0" distB="0" distL="0" distR="0" wp14:anchorId="6708840C" wp14:editId="464B27CB">
+            <wp:extent cx="6858000" cy="3402965"/>
+            <wp:effectExtent l="0" t="0" r="0" b="6985"/>
+            <wp:docPr id="762740509" name="Picture 1"/>
+            <wp:cNvGraphicFramePr>
+              <a:graphicFrameLocks xmlns:a="http://schemas.openxmlformats.org/drawingml/2006/main" noChangeAspect="1"/>
+            </wp:cNvGraphicFramePr>
+            <a:graphic xmlns:a="http://schemas.openxmlformats.org/drawingml/2006/main">
+              <a:graphicData uri="http://schemas.openxmlformats.org/drawingml/2006/picture">
+                <pic:pic xmlns:pic="http://schemas.openxmlformats.org/drawingml/2006/picture">
+                  <pic:nvPicPr>
+                    <pic:cNvPr id="762740509" name=""/>
+                    <pic:cNvPicPr/>
+                  </pic:nvPicPr>
+                  <pic:blipFill>
+                    <a:blip r:embed="rId6"/>
+                    <a:stretch>
+                      <a:fillRect/>
+                    </a:stretch>
+                  </pic:blipFill>
+                  <pic:spPr>
+                    <a:xfrm>
+                      <a:off x="0" y="0"/>
+                      <a:ext cx="6858000" cy="3402965"/>
+                    </a:xfrm>
+                    <a:prstGeom prst="rect">
+                      <a:avLst/>
+                    </a:prstGeom>
+                  </pic:spPr>
+                </pic:pic>
+              </a:graphicData>
+            </a:graphic>
+          </wp:inline>
+        </w:drawing>
       </w:r>
     </w:p>
     <w:p>

</xml_diff>